<commit_message>
Semana hasta el 16 03
</commit_message>
<xml_diff>
--- a/templates/acta_cambios.docx
+++ b/templates/acta_cambios.docx
@@ -44,18 +44,7 @@
           <w:sz w:val="36"/>
           <w:szCs w:val="36"/>
         </w:rPr>
-        <w:t>{{ titulo }}</w:t>
-      </w:r>
-      <w:r>
-        <w:rPr>
-          <w:rFonts w:ascii="Arial" w:hAnsi="Arial" w:cs="Arial"/>
-          <w:b/>
-          <w:bCs/>
-          <w:color w:val="000000" w:themeColor="text1"/>
-          <w:sz w:val="36"/>
-          <w:szCs w:val="36"/>
-        </w:rPr>
-        <w:t xml:space="preserve"> No. {{ numero }}</w:t>
+        <w:t>{{ titulo }} No. {{ numero }}</w:t>
       </w:r>
     </w:p>
     <w:p>
@@ -641,15 +630,7 @@
                 <w:sz w:val="20"/>
                 <w:szCs w:val="20"/>
               </w:rPr>
-              <w:t>Gerente</w:t>
-            </w:r>
-            <w:r>
-              <w:rPr>
-                <w:rFonts w:ascii="Arial" w:hAnsi="Arial" w:cs="Arial"/>
-                <w:sz w:val="20"/>
-                <w:szCs w:val="20"/>
-              </w:rPr>
-              <w:t xml:space="preserve"> seguridad de la información</w:t>
+              <w:t>Gerente seguridad de la información</w:t>
             </w:r>
           </w:p>
         </w:tc>
@@ -957,6 +938,7 @@
             <w:tcBorders>
               <w:top w:val="single" w:sz="4" w:space="0" w:color="000000"/>
               <w:left w:val="single" w:sz="4" w:space="0" w:color="000000"/>
+              <w:bottom w:val="single" w:sz="4" w:space="0" w:color="000000"/>
               <w:right w:val="single" w:sz="4" w:space="0" w:color="000000"/>
             </w:tcBorders>
             <w:shd w:val="clear" w:color="auto" w:fill="D9D9D9" w:themeFill="background1" w:themeFillShade="D9"/>
@@ -2032,15 +2014,7 @@
                 <w:sz w:val="20"/>
                 <w:szCs w:val="20"/>
               </w:rPr>
-              <w:t xml:space="preserve">Líder </w:t>
-            </w:r>
-            <w:r>
-              <w:rPr>
-                <w:rFonts w:ascii="Arial" w:hAnsi="Arial" w:cs="Arial"/>
-                <w:sz w:val="20"/>
-                <w:szCs w:val="20"/>
-              </w:rPr>
-              <w:t>de operaciones</w:t>
+              <w:t>Líder de operaciones</w:t>
             </w:r>
           </w:p>
         </w:tc>
@@ -2108,9 +2082,9 @@
         <w:tblLook w:val="04A0" w:firstRow="1" w:lastRow="0" w:firstColumn="1" w:lastColumn="0" w:noHBand="0" w:noVBand="1"/>
       </w:tblPr>
       <w:tblGrid>
-        <w:gridCol w:w="3065"/>
+        <w:gridCol w:w="3064"/>
         <w:gridCol w:w="2075"/>
-        <w:gridCol w:w="2204"/>
+        <w:gridCol w:w="2205"/>
         <w:gridCol w:w="2050"/>
       </w:tblGrid>
       <w:tr>
@@ -2121,7 +2095,7 @@
         </w:trPr>
         <w:tc>
           <w:tcPr>
-            <w:tcW w:w="3065" w:type="dxa"/>
+            <w:tcW w:w="3068" w:type="dxa"/>
             <w:shd w:val="clear" w:color="auto" w:fill="D9D9D9" w:themeFill="background1" w:themeFillShade="D9"/>
             <w:vAlign w:val="center"/>
           </w:tcPr>
@@ -2150,7 +2124,7 @@
         </w:tc>
         <w:tc>
           <w:tcPr>
-            <w:tcW w:w="2075" w:type="dxa"/>
+            <w:tcW w:w="2077" w:type="dxa"/>
             <w:shd w:val="clear" w:color="auto" w:fill="D9D9D9" w:themeFill="background1" w:themeFillShade="D9"/>
             <w:vAlign w:val="center"/>
           </w:tcPr>
@@ -2179,7 +2153,7 @@
         </w:tc>
         <w:tc>
           <w:tcPr>
-            <w:tcW w:w="2204" w:type="dxa"/>
+            <w:tcW w:w="2207" w:type="dxa"/>
             <w:shd w:val="clear" w:color="auto" w:fill="D9D9D9" w:themeFill="background1" w:themeFillShade="D9"/>
             <w:vAlign w:val="center"/>
           </w:tcPr>
@@ -2208,7 +2182,7 @@
         </w:tc>
         <w:tc>
           <w:tcPr>
-            <w:tcW w:w="2050" w:type="dxa"/>
+            <w:tcW w:w="2052" w:type="dxa"/>
             <w:shd w:val="clear" w:color="auto" w:fill="D9D9D9" w:themeFill="background1" w:themeFillShade="D9"/>
             <w:vAlign w:val="center"/>
           </w:tcPr>
@@ -2243,7 +2217,7 @@
         </w:trPr>
         <w:tc>
           <w:tcPr>
-            <w:tcW w:w="3065" w:type="dxa"/>
+            <w:tcW w:w="3068" w:type="dxa"/>
             <w:vAlign w:val="center"/>
           </w:tcPr>
           <w:p>
@@ -2266,7 +2240,7 @@
         </w:tc>
         <w:tc>
           <w:tcPr>
-            <w:tcW w:w="2075" w:type="dxa"/>
+            <w:tcW w:w="2077" w:type="dxa"/>
             <w:vAlign w:val="center"/>
           </w:tcPr>
           <w:p>
@@ -2290,7 +2264,7 @@
         </w:tc>
         <w:tc>
           <w:tcPr>
-            <w:tcW w:w="2204" w:type="dxa"/>
+            <w:tcW w:w="2207" w:type="dxa"/>
             <w:vAlign w:val="center"/>
           </w:tcPr>
           <w:p>
@@ -2314,7 +2288,7 @@
         </w:tc>
         <w:tc>
           <w:tcPr>
-            <w:tcW w:w="2050" w:type="dxa"/>
+            <w:tcW w:w="2052" w:type="dxa"/>
             <w:vAlign w:val="center"/>
           </w:tcPr>
           <w:p>
@@ -2344,7 +2318,7 @@
         </w:trPr>
         <w:tc>
           <w:tcPr>
-            <w:tcW w:w="3065" w:type="dxa"/>
+            <w:tcW w:w="3068" w:type="dxa"/>
             <w:vAlign w:val="center"/>
           </w:tcPr>
           <w:p>
@@ -2368,7 +2342,7 @@
         </w:tc>
         <w:tc>
           <w:tcPr>
-            <w:tcW w:w="2075" w:type="dxa"/>
+            <w:tcW w:w="2077" w:type="dxa"/>
             <w:vAlign w:val="center"/>
           </w:tcPr>
           <w:p>
@@ -2392,7 +2366,7 @@
         </w:tc>
         <w:tc>
           <w:tcPr>
-            <w:tcW w:w="2204" w:type="dxa"/>
+            <w:tcW w:w="2207" w:type="dxa"/>
             <w:vAlign w:val="center"/>
           </w:tcPr>
           <w:p>
@@ -2417,7 +2391,7 @@
         </w:tc>
         <w:tc>
           <w:tcPr>
-            <w:tcW w:w="2050" w:type="dxa"/>
+            <w:tcW w:w="2052" w:type="dxa"/>
             <w:vAlign w:val="center"/>
           </w:tcPr>
           <w:p>
@@ -2447,7 +2421,7 @@
         </w:trPr>
         <w:tc>
           <w:tcPr>
-            <w:tcW w:w="3065" w:type="dxa"/>
+            <w:tcW w:w="3068" w:type="dxa"/>
             <w:vAlign w:val="center"/>
           </w:tcPr>
           <w:p>
@@ -2470,7 +2444,7 @@
         </w:tc>
         <w:tc>
           <w:tcPr>
-            <w:tcW w:w="2075" w:type="dxa"/>
+            <w:tcW w:w="2077" w:type="dxa"/>
             <w:vAlign w:val="center"/>
           </w:tcPr>
           <w:p>
@@ -2494,7 +2468,7 @@
         </w:tc>
         <w:tc>
           <w:tcPr>
-            <w:tcW w:w="2204" w:type="dxa"/>
+            <w:tcW w:w="2207" w:type="dxa"/>
             <w:vAlign w:val="center"/>
           </w:tcPr>
           <w:p>
@@ -2518,7 +2492,7 @@
         </w:tc>
         <w:tc>
           <w:tcPr>
-            <w:tcW w:w="2050" w:type="dxa"/>
+            <w:tcW w:w="2052" w:type="dxa"/>
             <w:vAlign w:val="center"/>
           </w:tcPr>
           <w:p>
@@ -2548,7 +2522,7 @@
         </w:trPr>
         <w:tc>
           <w:tcPr>
-            <w:tcW w:w="3065" w:type="dxa"/>
+            <w:tcW w:w="3068" w:type="dxa"/>
             <w:vAlign w:val="center"/>
           </w:tcPr>
           <w:p>
@@ -2571,7 +2545,7 @@
         </w:tc>
         <w:tc>
           <w:tcPr>
-            <w:tcW w:w="2075" w:type="dxa"/>
+            <w:tcW w:w="2077" w:type="dxa"/>
             <w:vAlign w:val="center"/>
           </w:tcPr>
           <w:p>
@@ -2595,7 +2569,7 @@
         </w:tc>
         <w:tc>
           <w:tcPr>
-            <w:tcW w:w="2204" w:type="dxa"/>
+            <w:tcW w:w="2207" w:type="dxa"/>
             <w:vAlign w:val="center"/>
           </w:tcPr>
           <w:p>
@@ -2619,7 +2593,7 @@
         </w:tc>
         <w:tc>
           <w:tcPr>
-            <w:tcW w:w="2050" w:type="dxa"/>
+            <w:tcW w:w="2052" w:type="dxa"/>
             <w:vAlign w:val="center"/>
           </w:tcPr>
           <w:p>
@@ -2649,7 +2623,7 @@
         </w:trPr>
         <w:tc>
           <w:tcPr>
-            <w:tcW w:w="3065" w:type="dxa"/>
+            <w:tcW w:w="3068" w:type="dxa"/>
             <w:vAlign w:val="center"/>
           </w:tcPr>
           <w:p>
@@ -2672,7 +2646,7 @@
         </w:tc>
         <w:tc>
           <w:tcPr>
-            <w:tcW w:w="2075" w:type="dxa"/>
+            <w:tcW w:w="2077" w:type="dxa"/>
             <w:vAlign w:val="center"/>
           </w:tcPr>
           <w:p>
@@ -2696,7 +2670,7 @@
         </w:tc>
         <w:tc>
           <w:tcPr>
-            <w:tcW w:w="2204" w:type="dxa"/>
+            <w:tcW w:w="2207" w:type="dxa"/>
             <w:vAlign w:val="center"/>
           </w:tcPr>
           <w:p>
@@ -2720,7 +2694,7 @@
         </w:tc>
         <w:tc>
           <w:tcPr>
-            <w:tcW w:w="2050" w:type="dxa"/>
+            <w:tcW w:w="2052" w:type="dxa"/>
             <w:vAlign w:val="center"/>
           </w:tcPr>
           <w:p>
@@ -2750,7 +2724,7 @@
         </w:trPr>
         <w:tc>
           <w:tcPr>
-            <w:tcW w:w="3065" w:type="dxa"/>
+            <w:tcW w:w="3068" w:type="dxa"/>
             <w:vAlign w:val="center"/>
           </w:tcPr>
           <w:p>
@@ -2773,7 +2747,7 @@
         </w:tc>
         <w:tc>
           <w:tcPr>
-            <w:tcW w:w="2075" w:type="dxa"/>
+            <w:tcW w:w="2077" w:type="dxa"/>
             <w:vAlign w:val="center"/>
           </w:tcPr>
           <w:p>
@@ -2797,7 +2771,7 @@
         </w:tc>
         <w:tc>
           <w:tcPr>
-            <w:tcW w:w="2204" w:type="dxa"/>
+            <w:tcW w:w="2207" w:type="dxa"/>
             <w:vAlign w:val="center"/>
           </w:tcPr>
           <w:p>
@@ -2821,7 +2795,7 @@
         </w:tc>
         <w:tc>
           <w:tcPr>
-            <w:tcW w:w="2050" w:type="dxa"/>
+            <w:tcW w:w="2052" w:type="dxa"/>
             <w:vAlign w:val="center"/>
           </w:tcPr>
           <w:p>
@@ -2851,7 +2825,7 @@
         </w:trPr>
         <w:tc>
           <w:tcPr>
-            <w:tcW w:w="3065" w:type="dxa"/>
+            <w:tcW w:w="3068" w:type="dxa"/>
             <w:vAlign w:val="center"/>
           </w:tcPr>
           <w:p>
@@ -2875,7 +2849,7 @@
         </w:tc>
         <w:tc>
           <w:tcPr>
-            <w:tcW w:w="2075" w:type="dxa"/>
+            <w:tcW w:w="2077" w:type="dxa"/>
             <w:vAlign w:val="center"/>
           </w:tcPr>
           <w:p>
@@ -2899,7 +2873,7 @@
         </w:tc>
         <w:tc>
           <w:tcPr>
-            <w:tcW w:w="2204" w:type="dxa"/>
+            <w:tcW w:w="2207" w:type="dxa"/>
             <w:vAlign w:val="center"/>
           </w:tcPr>
           <w:p>
@@ -2923,7 +2897,7 @@
         </w:tc>
         <w:tc>
           <w:tcPr>
-            <w:tcW w:w="2050" w:type="dxa"/>
+            <w:tcW w:w="2052" w:type="dxa"/>
             <w:vAlign w:val="center"/>
           </w:tcPr>
           <w:p>
@@ -2953,7 +2927,7 @@
         </w:trPr>
         <w:tc>
           <w:tcPr>
-            <w:tcW w:w="3065" w:type="dxa"/>
+            <w:tcW w:w="3068" w:type="dxa"/>
             <w:vAlign w:val="center"/>
           </w:tcPr>
           <w:p>
@@ -2976,7 +2950,7 @@
         </w:tc>
         <w:tc>
           <w:tcPr>
-            <w:tcW w:w="2075" w:type="dxa"/>
+            <w:tcW w:w="2077" w:type="dxa"/>
             <w:vAlign w:val="center"/>
           </w:tcPr>
           <w:p>
@@ -3000,7 +2974,7 @@
         </w:tc>
         <w:tc>
           <w:tcPr>
-            <w:tcW w:w="2204" w:type="dxa"/>
+            <w:tcW w:w="2207" w:type="dxa"/>
             <w:vAlign w:val="center"/>
           </w:tcPr>
           <w:p>
@@ -3024,7 +2998,7 @@
         </w:tc>
         <w:tc>
           <w:tcPr>
-            <w:tcW w:w="2050" w:type="dxa"/>
+            <w:tcW w:w="2052" w:type="dxa"/>
             <w:vAlign w:val="center"/>
           </w:tcPr>
           <w:p>
@@ -3054,7 +3028,7 @@
         </w:trPr>
         <w:tc>
           <w:tcPr>
-            <w:tcW w:w="3065" w:type="dxa"/>
+            <w:tcW w:w="3068" w:type="dxa"/>
             <w:vAlign w:val="center"/>
           </w:tcPr>
           <w:p>
@@ -3077,7 +3051,7 @@
         </w:tc>
         <w:tc>
           <w:tcPr>
-            <w:tcW w:w="2075" w:type="dxa"/>
+            <w:tcW w:w="2077" w:type="dxa"/>
             <w:vAlign w:val="center"/>
           </w:tcPr>
           <w:p>
@@ -3101,7 +3075,7 @@
         </w:tc>
         <w:tc>
           <w:tcPr>
-            <w:tcW w:w="2204" w:type="dxa"/>
+            <w:tcW w:w="2207" w:type="dxa"/>
             <w:vAlign w:val="center"/>
           </w:tcPr>
           <w:p>
@@ -3125,7 +3099,7 @@
         </w:tc>
         <w:tc>
           <w:tcPr>
-            <w:tcW w:w="2050" w:type="dxa"/>
+            <w:tcW w:w="2052" w:type="dxa"/>
             <w:vAlign w:val="center"/>
           </w:tcPr>
           <w:p>
@@ -3155,7 +3129,7 @@
         </w:trPr>
         <w:tc>
           <w:tcPr>
-            <w:tcW w:w="3065" w:type="dxa"/>
+            <w:tcW w:w="3068" w:type="dxa"/>
             <w:vAlign w:val="center"/>
           </w:tcPr>
           <w:p>
@@ -3178,39 +3152,39 @@
         </w:tc>
         <w:tc>
           <w:tcPr>
-            <w:tcW w:w="2075" w:type="dxa"/>
-            <w:vAlign w:val="center"/>
-          </w:tcPr>
-          <w:p>
-            <w:pPr>
-              <w:jc w:val="center"/>
-              <w:rPr>
-                <w:rFonts w:ascii="Arial" w:hAnsi="Arial" w:cs="Arial"/>
-                <w:sz w:val="20"/>
-                <w:szCs w:val="20"/>
-              </w:rPr>
-            </w:pPr>
-          </w:p>
-        </w:tc>
-        <w:tc>
-          <w:tcPr>
-            <w:tcW w:w="2204" w:type="dxa"/>
-            <w:vAlign w:val="center"/>
-          </w:tcPr>
-          <w:p>
-            <w:pPr>
-              <w:jc w:val="center"/>
-              <w:rPr>
-                <w:rFonts w:ascii="Arial" w:hAnsi="Arial" w:cs="Arial"/>
-                <w:sz w:val="20"/>
-                <w:szCs w:val="20"/>
-              </w:rPr>
-            </w:pPr>
-          </w:p>
-        </w:tc>
-        <w:tc>
-          <w:tcPr>
-            <w:tcW w:w="2050" w:type="dxa"/>
+            <w:tcW w:w="2077" w:type="dxa"/>
+            <w:vAlign w:val="center"/>
+          </w:tcPr>
+          <w:p>
+            <w:pPr>
+              <w:jc w:val="center"/>
+              <w:rPr>
+                <w:rFonts w:ascii="Arial" w:hAnsi="Arial" w:cs="Arial"/>
+                <w:sz w:val="20"/>
+                <w:szCs w:val="20"/>
+              </w:rPr>
+            </w:pPr>
+          </w:p>
+        </w:tc>
+        <w:tc>
+          <w:tcPr>
+            <w:tcW w:w="2207" w:type="dxa"/>
+            <w:vAlign w:val="center"/>
+          </w:tcPr>
+          <w:p>
+            <w:pPr>
+              <w:jc w:val="center"/>
+              <w:rPr>
+                <w:rFonts w:ascii="Arial" w:hAnsi="Arial" w:cs="Arial"/>
+                <w:sz w:val="20"/>
+                <w:szCs w:val="20"/>
+              </w:rPr>
+            </w:pPr>
+          </w:p>
+        </w:tc>
+        <w:tc>
+          <w:tcPr>
+            <w:tcW w:w="2052" w:type="dxa"/>
             <w:vAlign w:val="center"/>
           </w:tcPr>
           <w:p>
@@ -3608,7 +3582,34 @@
                 <w:szCs w:val="20"/>
                 <w:lang w:val="es-CO"/>
               </w:rPr>
-              <w:t>{{t.lider}}</w:t>
+              <w:t>{{t.</w:t>
+            </w:r>
+            <w:r>
+              <w:rPr>
+                <w:rFonts w:ascii="Arial" w:hAnsi="Arial" w:cs="Arial"/>
+                <w:sz w:val="20"/>
+                <w:szCs w:val="20"/>
+                <w:lang w:val="es-CO"/>
+              </w:rPr>
+              <w:t>solicitante</w:t>
+            </w:r>
+            <w:r>
+              <w:rPr>
+                <w:rFonts w:ascii="Arial" w:hAnsi="Arial" w:cs="Arial"/>
+                <w:sz w:val="20"/>
+                <w:szCs w:val="20"/>
+                <w:lang w:val="es-CO"/>
+              </w:rPr>
+              <w:t>.nombre</w:t>
+            </w:r>
+            <w:r>
+              <w:rPr>
+                <w:rFonts w:ascii="Arial" w:hAnsi="Arial" w:cs="Arial"/>
+                <w:sz w:val="20"/>
+                <w:szCs w:val="20"/>
+                <w:lang w:val="es-CO"/>
+              </w:rPr>
+              <w:t>}}</w:t>
             </w:r>
           </w:p>
         </w:tc>
@@ -3908,12 +3909,12 @@
         <w:tblLook w:val="0000" w:firstRow="0" w:lastRow="0" w:firstColumn="0" w:lastColumn="0" w:noHBand="0" w:noVBand="0"/>
       </w:tblPr>
       <w:tblGrid>
-        <w:gridCol w:w="426"/>
+        <w:gridCol w:w="425"/>
         <w:gridCol w:w="3263"/>
         <w:gridCol w:w="2346"/>
         <w:gridCol w:w="706"/>
         <w:gridCol w:w="1403"/>
-        <w:gridCol w:w="1250"/>
+        <w:gridCol w:w="1251"/>
       </w:tblGrid>
       <w:tr>
         <w:trPr>
@@ -4000,7 +4001,7 @@
         </w:trPr>
         <w:tc>
           <w:tcPr>
-            <w:tcW w:w="3693" w:type="dxa"/>
+            <w:tcW w:w="3692" w:type="dxa"/>
             <w:gridSpan w:val="2"/>
             <w:tcBorders>
               <w:top w:val="single" w:sz="4" w:space="0" w:color="000000"/>
@@ -4072,7 +4073,7 @@
         </w:tc>
         <w:tc>
           <w:tcPr>
-            <w:tcW w:w="2655" w:type="dxa"/>
+            <w:tcW w:w="2656" w:type="dxa"/>
             <w:gridSpan w:val="2"/>
             <w:tcBorders>
               <w:top w:val="single" w:sz="4" w:space="0" w:color="000000"/>
@@ -4114,7 +4115,7 @@
         </w:trPr>
         <w:tc>
           <w:tcPr>
-            <w:tcW w:w="3693" w:type="dxa"/>
+            <w:tcW w:w="3692" w:type="dxa"/>
             <w:gridSpan w:val="2"/>
             <w:tcBorders>
               <w:top w:val="single" w:sz="4" w:space="0" w:color="000000"/>
@@ -4160,7 +4161,7 @@
         </w:tc>
         <w:tc>
           <w:tcPr>
-            <w:tcW w:w="2655" w:type="dxa"/>
+            <w:tcW w:w="2656" w:type="dxa"/>
             <w:gridSpan w:val="2"/>
             <w:tcBorders>
               <w:top w:val="single" w:sz="4" w:space="0" w:color="000000"/>
@@ -4177,7 +4178,7 @@
                 <w:sz w:val="20"/>
                 <w:szCs w:val="20"/>
               </w:rPr>
-              <w:t>{{r.solicitante}}</w:t>
+              <w:t>{{r.solicitante.nombre}}</w:t>
             </w:r>
           </w:p>
         </w:tc>
@@ -4189,7 +4190,7 @@
         </w:trPr>
         <w:tc>
           <w:tcPr>
-            <w:tcW w:w="3693" w:type="dxa"/>
+            <w:tcW w:w="3692" w:type="dxa"/>
             <w:gridSpan w:val="2"/>
             <w:tcBorders>
               <w:top w:val="single" w:sz="4" w:space="0" w:color="000000"/>
@@ -4235,7 +4236,7 @@
         </w:tc>
         <w:tc>
           <w:tcPr>
-            <w:tcW w:w="2655" w:type="dxa"/>
+            <w:tcW w:w="2656" w:type="dxa"/>
             <w:gridSpan w:val="2"/>
             <w:tcBorders>
               <w:top w:val="single" w:sz="4" w:space="0" w:color="000000"/>
@@ -4368,29 +4369,7 @@
                 <w:szCs w:val="20"/>
                 <w:u w:val="single"/>
               </w:rPr>
-              <w:t>votan Aprobado Alejandro Martínez, Elkin Gómez, Rodrigo López, Eduardo Rodríguez, Julieth Gómez,</w:t>
-            </w:r>
-            <w:r>
-              <w:rPr>
-                <w:b/>
-                <w:bCs/>
-                <w:i/>
-                <w:iCs/>
-                <w:szCs w:val="20"/>
-                <w:u w:val="single"/>
-              </w:rPr>
-              <w:t xml:space="preserve"> Judy Barrera,</w:t>
-            </w:r>
-            <w:r>
-              <w:rPr>
-                <w:b/>
-                <w:bCs/>
-                <w:i/>
-                <w:iCs/>
-                <w:szCs w:val="20"/>
-                <w:u w:val="single"/>
-              </w:rPr>
-              <w:t xml:space="preserve"> Ayda Castro y Alberto Arango.</w:t>
+              <w:t>votan Aprobado Alejandro Martínez, Elkin Gómez, Rodrigo López, Julieth Gómez, Judy Barrera, Ayda Castro y Alberto Arango.</w:t>
             </w:r>
           </w:p>
           <w:p>
@@ -4439,13 +4418,6 @@
               <w:pStyle w:val="Textoindependiente"/>
               <w:jc w:val="both"/>
               <w:rPr>
-                <w:rFonts w:ascii="Times New Roman" w:hAnsi="Times New Roman"/>
-                <w:sz w:val="24"/>
-                <w:szCs w:val="24"/>
-              </w:rPr>
-            </w:pPr>
-            <w:r>
-              <w:rPr>
                 <w:rStyle w:val="Fuerte"/>
                 <w:rFonts w:cs="Times New Roman"/>
                 <w:i/>
@@ -4454,8 +4426,7 @@
                 <w:u w:val="single"/>
                 <w:lang w:val="es-ES"/>
               </w:rPr>
-              <w:t>Los miembros del comité que no dieron respuesta son</w:t>
-            </w:r>
+            </w:pPr>
             <w:r>
               <w:rPr>
                 <w:rStyle w:val="Fuerte"/>
@@ -4466,8 +4437,19 @@
                 <w:u w:val="single"/>
                 <w:lang w:val="es-ES"/>
               </w:rPr>
-              <w:t xml:space="preserve"> </w:t>
-            </w:r>
+              <w:t xml:space="preserve">Los miembros del comité que no dieron respuesta son </w:t>
+            </w:r>
+          </w:p>
+          <w:p>
+            <w:pPr>
+              <w:pStyle w:val="Textoindependiente"/>
+              <w:jc w:val="both"/>
+              <w:rPr>
+                <w:rFonts w:ascii="Times New Roman" w:hAnsi="Times New Roman"/>
+                <w:sz w:val="24"/>
+                <w:szCs w:val="24"/>
+              </w:rPr>
+            </w:pPr>
           </w:p>
         </w:tc>
       </w:tr>
@@ -4478,7 +4460,7 @@
         </w:trPr>
         <w:tc>
           <w:tcPr>
-            <w:tcW w:w="426" w:type="dxa"/>
+            <w:tcW w:w="425" w:type="dxa"/>
             <w:tcBorders>
               <w:top w:val="single" w:sz="4" w:space="0" w:color="000000"/>
               <w:left w:val="single" w:sz="4" w:space="0" w:color="000000"/>
@@ -4669,7 +4651,7 @@
         </w:tc>
         <w:tc>
           <w:tcPr>
-            <w:tcW w:w="1251" w:type="dxa"/>
+            <w:tcW w:w="1252" w:type="dxa"/>
             <w:tcBorders>
               <w:top w:val="single" w:sz="4" w:space="0" w:color="000000"/>
               <w:left w:val="single" w:sz="4" w:space="0" w:color="000000"/>
@@ -4707,7 +4689,7 @@
         </w:trPr>
         <w:tc>
           <w:tcPr>
-            <w:tcW w:w="426" w:type="dxa"/>
+            <w:tcW w:w="425" w:type="dxa"/>
             <w:tcBorders>
               <w:top w:val="single" w:sz="4" w:space="0" w:color="000000"/>
               <w:left w:val="single" w:sz="4" w:space="0" w:color="000000"/>
@@ -4807,7 +4789,7 @@
                 <w:szCs w:val="20"/>
                 <w:lang w:val="es-CO"/>
               </w:rPr>
-              <w:t>{{ b.lider }}</w:t>
+              <w:t>{{ b.solicitante.nombre }}</w:t>
             </w:r>
           </w:p>
         </w:tc>
@@ -4875,7 +4857,7 @@
         </w:tc>
         <w:tc>
           <w:tcPr>
-            <w:tcW w:w="1251" w:type="dxa"/>
+            <w:tcW w:w="1252" w:type="dxa"/>
             <w:tcBorders>
               <w:top w:val="single" w:sz="4" w:space="0" w:color="000000"/>
               <w:left w:val="single" w:sz="4" w:space="0" w:color="000000"/>
@@ -4912,7 +4894,7 @@
         </w:trPr>
         <w:tc>
           <w:tcPr>
-            <w:tcW w:w="426" w:type="dxa"/>
+            <w:tcW w:w="425" w:type="dxa"/>
             <w:tcBorders>
               <w:top w:val="single" w:sz="4" w:space="0" w:color="000000"/>
               <w:left w:val="single" w:sz="4" w:space="0" w:color="000000"/>
@@ -5072,7 +5054,7 @@
         </w:tc>
         <w:tc>
           <w:tcPr>
-            <w:tcW w:w="1251" w:type="dxa"/>
+            <w:tcW w:w="1252" w:type="dxa"/>
             <w:tcBorders>
               <w:top w:val="single" w:sz="4" w:space="0" w:color="000000"/>
               <w:left w:val="single" w:sz="4" w:space="0" w:color="000000"/>
@@ -5171,7 +5153,7 @@
         </w:trPr>
         <w:tc>
           <w:tcPr>
-            <w:tcW w:w="426" w:type="dxa"/>
+            <w:tcW w:w="425" w:type="dxa"/>
             <w:tcBorders>
               <w:top w:val="single" w:sz="4" w:space="0" w:color="000000"/>
               <w:left w:val="single" w:sz="4" w:space="0" w:color="000000"/>
@@ -5296,7 +5278,7 @@
         </w:tc>
         <w:tc>
           <w:tcPr>
-            <w:tcW w:w="1251" w:type="dxa"/>
+            <w:tcW w:w="1252" w:type="dxa"/>
             <w:tcBorders>
               <w:top w:val="single" w:sz="4" w:space="0" w:color="000000"/>
               <w:left w:val="single" w:sz="4" w:space="0" w:color="000000"/>
@@ -5325,7 +5307,7 @@
         </w:trPr>
         <w:tc>
           <w:tcPr>
-            <w:tcW w:w="426" w:type="dxa"/>
+            <w:tcW w:w="425" w:type="dxa"/>
             <w:tcBorders>
               <w:top w:val="single" w:sz="4" w:space="0" w:color="000000"/>
               <w:left w:val="single" w:sz="4" w:space="0" w:color="000000"/>
@@ -5442,7 +5424,7 @@
         </w:tc>
         <w:tc>
           <w:tcPr>
-            <w:tcW w:w="1251" w:type="dxa"/>
+            <w:tcW w:w="1252" w:type="dxa"/>
             <w:tcBorders>
               <w:top w:val="single" w:sz="4" w:space="0" w:color="000000"/>
               <w:left w:val="single" w:sz="4" w:space="0" w:color="000000"/>
@@ -5471,7 +5453,7 @@
         </w:trPr>
         <w:tc>
           <w:tcPr>
-            <w:tcW w:w="426" w:type="dxa"/>
+            <w:tcW w:w="425" w:type="dxa"/>
             <w:tcBorders>
               <w:top w:val="single" w:sz="4" w:space="0" w:color="000000"/>
               <w:left w:val="single" w:sz="4" w:space="0" w:color="000000"/>
@@ -5596,7 +5578,7 @@
         </w:tc>
         <w:tc>
           <w:tcPr>
-            <w:tcW w:w="1251" w:type="dxa"/>
+            <w:tcW w:w="1252" w:type="dxa"/>
             <w:tcBorders>
               <w:top w:val="single" w:sz="4" w:space="0" w:color="000000"/>
               <w:left w:val="single" w:sz="4" w:space="0" w:color="000000"/>
@@ -5659,8 +5641,8 @@
       <w:tblGrid>
         <w:gridCol w:w="2077"/>
         <w:gridCol w:w="3937"/>
-        <w:gridCol w:w="1735"/>
-        <w:gridCol w:w="1639"/>
+        <w:gridCol w:w="1734"/>
+        <w:gridCol w:w="1640"/>
       </w:tblGrid>
       <w:tr>
         <w:trPr>
@@ -5780,7 +5762,7 @@
         </w:tc>
         <w:tc>
           <w:tcPr>
-            <w:tcW w:w="1738" w:type="dxa"/>
+            <w:tcW w:w="1737" w:type="dxa"/>
             <w:tcBorders>
               <w:top w:val="single" w:sz="6" w:space="0" w:color="000000"/>
               <w:left w:val="single" w:sz="4" w:space="0" w:color="000000"/>
@@ -5815,7 +5797,7 @@
         </w:tc>
         <w:tc>
           <w:tcPr>
-            <w:tcW w:w="1642" w:type="dxa"/>
+            <w:tcW w:w="1643" w:type="dxa"/>
             <w:tcBorders>
               <w:top w:val="single" w:sz="6" w:space="0" w:color="000000"/>
               <w:left w:val="single" w:sz="4" w:space="0" w:color="000000"/>
@@ -5899,7 +5881,7 @@
         </w:tc>
         <w:tc>
           <w:tcPr>
-            <w:tcW w:w="1738" w:type="dxa"/>
+            <w:tcW w:w="1737" w:type="dxa"/>
             <w:tcBorders>
               <w:top w:val="single" w:sz="6" w:space="0" w:color="000000"/>
               <w:left w:val="single" w:sz="4" w:space="0" w:color="000000"/>
@@ -5915,13 +5897,13 @@
                 <w:sz w:val="20"/>
                 <w:szCs w:val="20"/>
               </w:rPr>
-              <w:t>{{r.solicitante}}</w:t>
-            </w:r>
-          </w:p>
-        </w:tc>
-        <w:tc>
-          <w:tcPr>
-            <w:tcW w:w="1642" w:type="dxa"/>
+              <w:t>{{r.solicitante.nombre}}</w:t>
+            </w:r>
+          </w:p>
+        </w:tc>
+        <w:tc>
+          <w:tcPr>
+            <w:tcW w:w="1643" w:type="dxa"/>
             <w:tcBorders>
               <w:top w:val="single" w:sz="6" w:space="0" w:color="000000"/>
               <w:left w:val="single" w:sz="4" w:space="0" w:color="000000"/>
@@ -6000,7 +5982,7 @@
         </w:tc>
         <w:tc>
           <w:tcPr>
-            <w:tcW w:w="1738" w:type="dxa"/>
+            <w:tcW w:w="1737" w:type="dxa"/>
             <w:tcBorders>
               <w:top w:val="single" w:sz="6" w:space="0" w:color="000000"/>
               <w:left w:val="single" w:sz="4" w:space="0" w:color="000000"/>
@@ -6017,7 +5999,7 @@
         </w:tc>
         <w:tc>
           <w:tcPr>
-            <w:tcW w:w="1642" w:type="dxa"/>
+            <w:tcW w:w="1643" w:type="dxa"/>
             <w:tcBorders>
               <w:top w:val="single" w:sz="6" w:space="0" w:color="000000"/>
               <w:left w:val="single" w:sz="4" w:space="0" w:color="000000"/>
@@ -6044,12 +6026,12 @@
       </w:pPr>
     </w:p>
     <w:sectPr>
-      <w:headerReference w:type="even" r:id="rId11"/>
-      <w:headerReference w:type="default" r:id="rId12"/>
-      <w:footerReference w:type="even" r:id="rId13"/>
-      <w:footerReference w:type="default" r:id="rId14"/>
-      <w:headerReference w:type="first" r:id="rId15"/>
-      <w:footerReference w:type="first" r:id="rId16"/>
+      <w:headerReference w:type="even" r:id="rId10"/>
+      <w:headerReference w:type="default" r:id="rId11"/>
+      <w:footerReference w:type="even" r:id="rId12"/>
+      <w:footerReference w:type="default" r:id="rId13"/>
+      <w:headerReference w:type="first" r:id="rId14"/>
+      <w:footerReference w:type="first" r:id="rId15"/>
       <w:pgSz w:w="12240" w:h="15840"/>
       <w:pgMar w:top="851" w:right="1418" w:bottom="567" w:left="1418" w:header="567" w:footer="284" w:gutter="0"/>
       <w:cols w:space="720"/>
@@ -6262,7 +6244,7 @@
               <w:noProof/>
             </w:rPr>
             <w:drawing>
-              <wp:inline distT="0" distB="0" distL="0" distR="0" wp14:anchorId="731BDA22" wp14:editId="0E8C428A">
+              <wp:inline distT="0" distB="0" distL="0" distR="0" wp14:anchorId="5F103655" wp14:editId="0C014FC5">
                 <wp:extent cx="1038225" cy="1095375"/>
                 <wp:effectExtent l="0" t="0" r="0" b="0"/>
                 <wp:docPr id="1" name="Imagen 1" descr="Descripción: cid:image005.png@01D25AB8.4A362370"/>
@@ -6665,7 +6647,7 @@
               <w:noProof/>
             </w:rPr>
             <w:drawing>
-              <wp:inline distT="0" distB="0" distL="0" distR="0" wp14:anchorId="35E16919" wp14:editId="2389AA11">
+              <wp:inline distT="0" distB="0" distL="0" distR="0" wp14:anchorId="295DF9D5" wp14:editId="15461BE0">
                 <wp:extent cx="1038225" cy="1095375"/>
                 <wp:effectExtent l="0" t="0" r="0" b="0"/>
                 <wp:docPr id="2" name="Imagen 1" descr="Descripción: cid:image005.png@01D25AB8.4A362370"/>
@@ -7016,243 +6998,6 @@
     </w:pPr>
   </w:p>
 </w:hdr>
-</file>
-
-<file path=word/numbering.xml><?xml version="1.0" encoding="utf-8"?>
-<w:numbering xmlns:wpc="http://schemas.microsoft.com/office/word/2010/wordprocessingCanvas" xmlns:cx="http://schemas.microsoft.com/office/drawing/2014/chartex" xmlns:cx1="http://schemas.microsoft.com/office/drawing/2015/9/8/chartex" xmlns:cx2="http://schemas.microsoft.com/office/drawing/2015/10/21/chartex" xmlns:cx3="http://schemas.microsoft.com/office/drawing/2016/5/9/chartex" xmlns:cx4="http://schemas.microsoft.com/office/drawing/2016/5/10/chartex" xmlns:cx5="http://schemas.microsoft.com/office/drawing/2016/5/11/chartex" xmlns:cx6="http://schemas.microsoft.com/office/drawing/2016/5/12/chartex" xmlns:cx7="http://schemas.microsoft.com/office/drawing/2016/5/13/chartex" xmlns:cx8="http://schemas.microsoft.com/office/drawing/2016/5/14/chartex" xmlns:mc="http://schemas.openxmlformats.org/markup-compatibility/2006" xmlns:aink="http://schemas.microsoft.com/office/drawing/2016/ink" xmlns:am3d="http://schemas.microsoft.com/office/drawing/2017/model3d" xmlns:o="urn:schemas-microsoft-com:office:office" xmlns:oel="http://schemas.microsoft.com/office/2019/extlst" xmlns:r="http://schemas.openxmlformats.org/officeDocument/2006/relationships" xmlns:m="http://schemas.openxmlformats.org/officeDocument/2006/math" xmlns:v="urn:schemas-microsoft-com:vml" xmlns:wp14="http://schemas.microsoft.com/office/word/2010/wordprocessingDrawing" xmlns:wp="http://schemas.openxmlformats.org/drawingml/2006/wordprocessingDrawing" xmlns:w10="urn:schemas-microsoft-com:office:word" xmlns:w="http://schemas.openxmlformats.org/wordprocessingml/2006/main" xmlns:w14="http://schemas.microsoft.com/office/word/2010/wordml" xmlns:w15="http://schemas.microsoft.com/office/word/2012/wordml" xmlns:w16cex="http://schemas.microsoft.com/office/word/2018/wordml/cex" xmlns:w16cid="http://schemas.microsoft.com/office/word/2016/wordml/cid" xmlns:w16="http://schemas.microsoft.com/office/word/2018/wordml" xmlns:w16du="http://schemas.microsoft.com/office/word/2023/wordml/word16du" xmlns:w16sdtdh="http://schemas.microsoft.com/office/word/2020/wordml/sdtdatahash" xmlns:w16sdtfl="http://schemas.microsoft.com/office/word/2024/wordml/sdtformatlock" xmlns:w16se="http://schemas.microsoft.com/office/word/2015/wordml/symex" xmlns:wpg="http://schemas.microsoft.com/office/word/2010/wordprocessingGroup" xmlns:wpi="http://schemas.microsoft.com/office/word/2010/wordprocessingInk" xmlns:wne="http://schemas.microsoft.com/office/word/2006/wordml" xmlns:wps="http://schemas.microsoft.com/office/word/2010/wordprocessingShape" mc:Ignorable="w14 w15 w16se w16cid w16 w16cex w16sdtdh w16sdtfl w16du wp14">
-  <w:abstractNum w:abstractNumId="0" w15:restartNumberingAfterBreak="0">
-    <w:nsid w:val="266C4005"/>
-    <w:multiLevelType w:val="hybridMultilevel"/>
-    <w:tmpl w:val="A8C6295E"/>
-    <w:lvl w:ilvl="0" w:tplc="240A0001">
-      <w:start w:val="1"/>
-      <w:numFmt w:val="bullet"/>
-      <w:lvlText w:val=""/>
-      <w:lvlJc w:val="left"/>
-      <w:pPr>
-        <w:ind w:left="720" w:hanging="360"/>
-      </w:pPr>
-      <w:rPr>
-        <w:rFonts w:ascii="Symbol" w:hAnsi="Symbol" w:hint="default"/>
-      </w:rPr>
-    </w:lvl>
-    <w:lvl w:ilvl="1" w:tplc="240A0003" w:tentative="1">
-      <w:start w:val="1"/>
-      <w:numFmt w:val="bullet"/>
-      <w:lvlText w:val="o"/>
-      <w:lvlJc w:val="left"/>
-      <w:pPr>
-        <w:ind w:left="1440" w:hanging="360"/>
-      </w:pPr>
-      <w:rPr>
-        <w:rFonts w:ascii="Courier New" w:hAnsi="Courier New" w:cs="Courier New" w:hint="default"/>
-      </w:rPr>
-    </w:lvl>
-    <w:lvl w:ilvl="2" w:tplc="240A0005" w:tentative="1">
-      <w:start w:val="1"/>
-      <w:numFmt w:val="bullet"/>
-      <w:lvlText w:val=""/>
-      <w:lvlJc w:val="left"/>
-      <w:pPr>
-        <w:ind w:left="2160" w:hanging="360"/>
-      </w:pPr>
-      <w:rPr>
-        <w:rFonts w:ascii="Wingdings" w:hAnsi="Wingdings" w:hint="default"/>
-      </w:rPr>
-    </w:lvl>
-    <w:lvl w:ilvl="3" w:tplc="240A0001" w:tentative="1">
-      <w:start w:val="1"/>
-      <w:numFmt w:val="bullet"/>
-      <w:lvlText w:val=""/>
-      <w:lvlJc w:val="left"/>
-      <w:pPr>
-        <w:ind w:left="2880" w:hanging="360"/>
-      </w:pPr>
-      <w:rPr>
-        <w:rFonts w:ascii="Symbol" w:hAnsi="Symbol" w:hint="default"/>
-      </w:rPr>
-    </w:lvl>
-    <w:lvl w:ilvl="4" w:tplc="240A0003" w:tentative="1">
-      <w:start w:val="1"/>
-      <w:numFmt w:val="bullet"/>
-      <w:lvlText w:val="o"/>
-      <w:lvlJc w:val="left"/>
-      <w:pPr>
-        <w:ind w:left="3600" w:hanging="360"/>
-      </w:pPr>
-      <w:rPr>
-        <w:rFonts w:ascii="Courier New" w:hAnsi="Courier New" w:cs="Courier New" w:hint="default"/>
-      </w:rPr>
-    </w:lvl>
-    <w:lvl w:ilvl="5" w:tplc="240A0005" w:tentative="1">
-      <w:start w:val="1"/>
-      <w:numFmt w:val="bullet"/>
-      <w:lvlText w:val=""/>
-      <w:lvlJc w:val="left"/>
-      <w:pPr>
-        <w:ind w:left="4320" w:hanging="360"/>
-      </w:pPr>
-      <w:rPr>
-        <w:rFonts w:ascii="Wingdings" w:hAnsi="Wingdings" w:hint="default"/>
-      </w:rPr>
-    </w:lvl>
-    <w:lvl w:ilvl="6" w:tplc="240A0001" w:tentative="1">
-      <w:start w:val="1"/>
-      <w:numFmt w:val="bullet"/>
-      <w:lvlText w:val=""/>
-      <w:lvlJc w:val="left"/>
-      <w:pPr>
-        <w:ind w:left="5040" w:hanging="360"/>
-      </w:pPr>
-      <w:rPr>
-        <w:rFonts w:ascii="Symbol" w:hAnsi="Symbol" w:hint="default"/>
-      </w:rPr>
-    </w:lvl>
-    <w:lvl w:ilvl="7" w:tplc="240A0003" w:tentative="1">
-      <w:start w:val="1"/>
-      <w:numFmt w:val="bullet"/>
-      <w:lvlText w:val="o"/>
-      <w:lvlJc w:val="left"/>
-      <w:pPr>
-        <w:ind w:left="5760" w:hanging="360"/>
-      </w:pPr>
-      <w:rPr>
-        <w:rFonts w:ascii="Courier New" w:hAnsi="Courier New" w:cs="Courier New" w:hint="default"/>
-      </w:rPr>
-    </w:lvl>
-    <w:lvl w:ilvl="8" w:tplc="240A0005" w:tentative="1">
-      <w:start w:val="1"/>
-      <w:numFmt w:val="bullet"/>
-      <w:lvlText w:val=""/>
-      <w:lvlJc w:val="left"/>
-      <w:pPr>
-        <w:ind w:left="6480" w:hanging="360"/>
-      </w:pPr>
-      <w:rPr>
-        <w:rFonts w:ascii="Wingdings" w:hAnsi="Wingdings" w:hint="default"/>
-      </w:rPr>
-    </w:lvl>
-  </w:abstractNum>
-  <w:abstractNum w:abstractNumId="1" w15:restartNumberingAfterBreak="0">
-    <w:nsid w:val="77221991"/>
-    <w:multiLevelType w:val="hybridMultilevel"/>
-    <w:tmpl w:val="00507842"/>
-    <w:lvl w:ilvl="0" w:tplc="240A0001">
-      <w:start w:val="1"/>
-      <w:numFmt w:val="bullet"/>
-      <w:lvlText w:val=""/>
-      <w:lvlJc w:val="left"/>
-      <w:pPr>
-        <w:ind w:left="720" w:hanging="360"/>
-      </w:pPr>
-      <w:rPr>
-        <w:rFonts w:ascii="Symbol" w:hAnsi="Symbol" w:hint="default"/>
-      </w:rPr>
-    </w:lvl>
-    <w:lvl w:ilvl="1" w:tplc="240A0003" w:tentative="1">
-      <w:start w:val="1"/>
-      <w:numFmt w:val="bullet"/>
-      <w:lvlText w:val="o"/>
-      <w:lvlJc w:val="left"/>
-      <w:pPr>
-        <w:ind w:left="1440" w:hanging="360"/>
-      </w:pPr>
-      <w:rPr>
-        <w:rFonts w:ascii="Courier New" w:hAnsi="Courier New" w:cs="Courier New" w:hint="default"/>
-      </w:rPr>
-    </w:lvl>
-    <w:lvl w:ilvl="2" w:tplc="240A0005" w:tentative="1">
-      <w:start w:val="1"/>
-      <w:numFmt w:val="bullet"/>
-      <w:lvlText w:val=""/>
-      <w:lvlJc w:val="left"/>
-      <w:pPr>
-        <w:ind w:left="2160" w:hanging="360"/>
-      </w:pPr>
-      <w:rPr>
-        <w:rFonts w:ascii="Wingdings" w:hAnsi="Wingdings" w:hint="default"/>
-      </w:rPr>
-    </w:lvl>
-    <w:lvl w:ilvl="3" w:tplc="240A0001" w:tentative="1">
-      <w:start w:val="1"/>
-      <w:numFmt w:val="bullet"/>
-      <w:lvlText w:val=""/>
-      <w:lvlJc w:val="left"/>
-      <w:pPr>
-        <w:ind w:left="2880" w:hanging="360"/>
-      </w:pPr>
-      <w:rPr>
-        <w:rFonts w:ascii="Symbol" w:hAnsi="Symbol" w:hint="default"/>
-      </w:rPr>
-    </w:lvl>
-    <w:lvl w:ilvl="4" w:tplc="240A0003" w:tentative="1">
-      <w:start w:val="1"/>
-      <w:numFmt w:val="bullet"/>
-      <w:lvlText w:val="o"/>
-      <w:lvlJc w:val="left"/>
-      <w:pPr>
-        <w:ind w:left="3600" w:hanging="360"/>
-      </w:pPr>
-      <w:rPr>
-        <w:rFonts w:ascii="Courier New" w:hAnsi="Courier New" w:cs="Courier New" w:hint="default"/>
-      </w:rPr>
-    </w:lvl>
-    <w:lvl w:ilvl="5" w:tplc="240A0005" w:tentative="1">
-      <w:start w:val="1"/>
-      <w:numFmt w:val="bullet"/>
-      <w:lvlText w:val=""/>
-      <w:lvlJc w:val="left"/>
-      <w:pPr>
-        <w:ind w:left="4320" w:hanging="360"/>
-      </w:pPr>
-      <w:rPr>
-        <w:rFonts w:ascii="Wingdings" w:hAnsi="Wingdings" w:hint="default"/>
-      </w:rPr>
-    </w:lvl>
-    <w:lvl w:ilvl="6" w:tplc="240A0001" w:tentative="1">
-      <w:start w:val="1"/>
-      <w:numFmt w:val="bullet"/>
-      <w:lvlText w:val=""/>
-      <w:lvlJc w:val="left"/>
-      <w:pPr>
-        <w:ind w:left="5040" w:hanging="360"/>
-      </w:pPr>
-      <w:rPr>
-        <w:rFonts w:ascii="Symbol" w:hAnsi="Symbol" w:hint="default"/>
-      </w:rPr>
-    </w:lvl>
-    <w:lvl w:ilvl="7" w:tplc="240A0003" w:tentative="1">
-      <w:start w:val="1"/>
-      <w:numFmt w:val="bullet"/>
-      <w:lvlText w:val="o"/>
-      <w:lvlJc w:val="left"/>
-      <w:pPr>
-        <w:ind w:left="5760" w:hanging="360"/>
-      </w:pPr>
-      <w:rPr>
-        <w:rFonts w:ascii="Courier New" w:hAnsi="Courier New" w:cs="Courier New" w:hint="default"/>
-      </w:rPr>
-    </w:lvl>
-    <w:lvl w:ilvl="8" w:tplc="240A0005" w:tentative="1">
-      <w:start w:val="1"/>
-      <w:numFmt w:val="bullet"/>
-      <w:lvlText w:val=""/>
-      <w:lvlJc w:val="left"/>
-      <w:pPr>
-        <w:ind w:left="6480" w:hanging="360"/>
-      </w:pPr>
-      <w:rPr>
-        <w:rFonts w:ascii="Wingdings" w:hAnsi="Wingdings" w:hint="default"/>
-      </w:rPr>
-    </w:lvl>
-  </w:abstractNum>
-  <w:num w:numId="1" w16cid:durableId="2007897610">
-    <w:abstractNumId w:val="0"/>
-  </w:num>
-  <w:num w:numId="2" w16cid:durableId="847985563">
-    <w:abstractNumId w:val="1"/>
-  </w:num>
-</w:numbering>
 </file>
 
 <file path=word/styles.xml><?xml version="1.0" encoding="utf-8"?>
@@ -7972,6 +7717,18 @@
       <w:iCs/>
     </w:rPr>
   </w:style>
+  <w:style w:type="character" w:customStyle="1" w:styleId="TextoindependienteCar">
+    <w:name w:val="Texto independiente Car"/>
+    <w:basedOn w:val="Fuentedeprrafopredeter"/>
+    <w:link w:val="Textoindependiente"/>
+    <w:qFormat/>
+    <w:rsid w:val="006D5B3C"/>
+    <w:rPr>
+      <w:rFonts w:ascii="Arial" w:hAnsi="Arial" w:cs="Arial"/>
+      <w:szCs w:val="22"/>
+      <w:lang w:eastAsia="es-ES"/>
+    </w:rPr>
+  </w:style>
   <w:style w:type="paragraph" w:customStyle="1" w:styleId="Heading">
     <w:name w:val="Heading"/>
     <w:basedOn w:val="Normal"/>
@@ -8223,13 +7980,13 @@
       <w:szCs w:val="24"/>
     </w:rPr>
   </w:style>
-  <w:style w:type="paragraph" w:customStyle="1" w:styleId="FrameContentsuser">
-    <w:name w:val="Frame Contents (user)"/>
+  <w:style w:type="paragraph" w:customStyle="1" w:styleId="FrameContents">
+    <w:name w:val="Frame Contents"/>
     <w:basedOn w:val="Normal"/>
     <w:qFormat/>
   </w:style>
-  <w:style w:type="paragraph" w:customStyle="1" w:styleId="FrameContents">
-    <w:name w:val="Frame Contents"/>
+  <w:style w:type="paragraph" w:customStyle="1" w:styleId="FrameContentsuser">
+    <w:name w:val="Frame Contents (user)"/>
     <w:basedOn w:val="Normal"/>
     <w:qFormat/>
   </w:style>
@@ -8269,17 +8026,6 @@
         <w:insideV w:val="single" w:sz="4" w:space="0" w:color="000000" w:themeColor="text1"/>
       </w:tblBorders>
     </w:tblPr>
-  </w:style>
-  <w:style w:type="character" w:customStyle="1" w:styleId="TextoindependienteCar">
-    <w:name w:val="Texto independiente Car"/>
-    <w:basedOn w:val="Fuentedeprrafopredeter"/>
-    <w:link w:val="Textoindependiente"/>
-    <w:rsid w:val="006D5B3C"/>
-    <w:rPr>
-      <w:rFonts w:ascii="Arial" w:hAnsi="Arial" w:cs="Arial"/>
-      <w:szCs w:val="22"/>
-      <w:lang w:eastAsia="es-ES"/>
-    </w:rPr>
   </w:style>
 </w:styles>
 </file>
@@ -8462,6 +8208,16 @@
 </file>
 
 <file path=customXml/item1.xml><?xml version="1.0" encoding="utf-8"?>
+<b:Sources xmlns:b="http://schemas.openxmlformats.org/officeDocument/2006/bibliography" xmlns="http://schemas.openxmlformats.org/officeDocument/2006/bibliography" SelectedStyle="\APA.XSL" StyleName="APA"/>
+</file>
+
+<file path=customXml/item2.xml><?xml version="1.0" encoding="utf-8"?>
+<p:properties xmlns:p="http://schemas.microsoft.com/office/2006/metadata/properties" xmlns:xsi="http://www.w3.org/2001/XMLSchema-instance">
+  <documentManagement/>
+</p:properties>
+</file>
+
+<file path=customXml/item3.xml><?xml version="1.0" encoding="utf-8"?>
 <ct:contentTypeSchema xmlns:ct="http://schemas.microsoft.com/office/2006/metadata/contentType" xmlns:ma="http://schemas.microsoft.com/office/2006/metadata/properties/metaAttributes" ct:_="" ma:_="" ma:contentTypeName="Documento" ma:contentTypeID="0x01010095E5418F79ED724097E390AAC1941F70" ma:contentTypeVersion="0" ma:contentTypeDescription="Crear nuevo documento." ma:contentTypeScope="" ma:versionID="31fddc9eebda3a6584e2ace4d708fecf">
   <xsd:schema xmlns:xsd="http://www.w3.org/2001/XMLSchema" xmlns:p="http://schemas.microsoft.com/office/2006/metadata/properties" targetNamespace="http://schemas.microsoft.com/office/2006/metadata/properties" ma:root="true" ma:fieldsID="b004d877ca112f136821ba8115f64728">
     <xsd:element name="properties">
@@ -8510,7 +8266,7 @@
 </ct:contentTypeSchema>
 </file>
 
-<file path=customXml/item2.xml><?xml version="1.0" encoding="utf-8"?>
+<file path=customXml/item4.xml><?xml version="1.0" encoding="utf-8"?>
 <?mso-contentType ?>
 <FormTemplates xmlns="http://schemas.microsoft.com/sharepoint/v3/contenttype/forms">
   <Display>DocumentLibraryForm</Display>
@@ -8519,17 +8275,23 @@
 </FormTemplates>
 </file>
 
-<file path=customXml/item3.xml><?xml version="1.0" encoding="utf-8"?>
-<b:Sources xmlns:b="http://schemas.openxmlformats.org/officeDocument/2006/bibliography" xmlns="http://schemas.openxmlformats.org/officeDocument/2006/bibliography" SelectedStyle="\APA.XSL" StyleName="APA"/>
+<file path=customXml/itemProps1.xml><?xml version="1.0" encoding="utf-8"?>
+<ds:datastoreItem xmlns:ds="http://schemas.openxmlformats.org/officeDocument/2006/customXml" ds:itemID="{ED199CE9-93E4-425D-BD6F-34EF838A4B7A}">
+  <ds:schemaRefs>
+    <ds:schemaRef ds:uri="http://schemas.openxmlformats.org/officeDocument/2006/bibliography"/>
+  </ds:schemaRefs>
+</ds:datastoreItem>
 </file>
 
-<file path=customXml/item4.xml><?xml version="1.0" encoding="utf-8"?>
-<p:properties xmlns:p="http://schemas.microsoft.com/office/2006/metadata/properties" xmlns:xsi="http://www.w3.org/2001/XMLSchema-instance">
-  <documentManagement/>
-</p:properties>
+<file path=customXml/itemProps2.xml><?xml version="1.0" encoding="utf-8"?>
+<ds:datastoreItem xmlns:ds="http://schemas.openxmlformats.org/officeDocument/2006/customXml" ds:itemID="{07AD071F-BE82-4C22-B521-18316808C39B}">
+  <ds:schemaRefs>
+    <ds:schemaRef ds:uri="http://schemas.microsoft.com/office/2006/metadata/properties"/>
+  </ds:schemaRefs>
+</ds:datastoreItem>
 </file>
 
-<file path=customXml/itemProps1.xml><?xml version="1.0" encoding="utf-8"?>
+<file path=customXml/itemProps3.xml><?xml version="1.0" encoding="utf-8"?>
 <ds:datastoreItem xmlns:ds="http://schemas.openxmlformats.org/officeDocument/2006/customXml" ds:itemID="{2845D359-1CCC-4A93-8344-31E7880F9FCD}">
   <ds:schemaRefs>
     <ds:schemaRef ds:uri="http://schemas.microsoft.com/office/2006/metadata/contentType"/>
@@ -8544,26 +8306,10 @@
 </ds:datastoreItem>
 </file>
 
-<file path=customXml/itemProps2.xml><?xml version="1.0" encoding="utf-8"?>
+<file path=customXml/itemProps4.xml><?xml version="1.0" encoding="utf-8"?>
 <ds:datastoreItem xmlns:ds="http://schemas.openxmlformats.org/officeDocument/2006/customXml" ds:itemID="{FE650A8E-6167-43F2-8D3E-70D4EC6EF9F7}">
   <ds:schemaRefs>
     <ds:schemaRef ds:uri="http://schemas.microsoft.com/sharepoint/v3/contenttype/forms"/>
   </ds:schemaRefs>
 </ds:datastoreItem>
-</file>
-
-<file path=customXml/itemProps3.xml><?xml version="1.0" encoding="utf-8"?>
-<ds:datastoreItem xmlns:ds="http://schemas.openxmlformats.org/officeDocument/2006/customXml" ds:itemID="{ED199CE9-93E4-425D-BD6F-34EF838A4B7A}">
-  <ds:schemaRefs>
-    <ds:schemaRef ds:uri="http://schemas.openxmlformats.org/officeDocument/2006/bibliography"/>
-  </ds:schemaRefs>
-</ds:datastoreItem>
-</file>
-
-<file path=customXml/itemProps4.xml><?xml version="1.0" encoding="utf-8"?>
-<ds:datastoreItem xmlns:ds="http://schemas.openxmlformats.org/officeDocument/2006/customXml" ds:itemID="{07AD071F-BE82-4C22-B521-18316808C39B}">
-  <ds:schemaRefs>
-    <ds:schemaRef ds:uri="http://schemas.microsoft.com/office/2006/metadata/properties"/>
-  </ds:schemaRefs>
-</ds:datastoreItem>
 </file>
</xml_diff>